<commit_message>
feat: added copy button and csv export to HTML catalog
</commit_message>
<xml_diff>
--- a/Varios PDF/PCAP/resultados_word/2025_132-PCAP.docx
+++ b/Varios PDF/PCAP/resultados_word/2025_132-PCAP.docx
@@ -7,12 +7,12 @@
         <w:pStyle w:val="Title"/>
       </w:pPr>
       <w:r>
-        <w:t>Análisis PCAP: 2025_132-PCAP</w:t>
+        <w:t>Criterios de Adjudicación: 2025_132-PCAP</w:t>
       </w:r>
     </w:p>
     <w:p>
       <w:r>
-        <w:t>No se encontraron secciones explícitas usando heurística básica. Revise el documento.</w:t>
+        <w:t>No se detectó la estructura de criterios esperada. Revise el PDF.</w:t>
       </w:r>
     </w:p>
     <w:sectPr>
@@ -24458,13 +24458,13 @@
 </file>
 
 <file path=customXml/itemProps2.xml><?xml version="1.0" encoding="utf-8"?>
-<ds:datastoreItem xmlns:ds="http://schemas.openxmlformats.org/officeDocument/2006/customXml" ds:itemID="{38E2809A-DAD2-45DA-BC02-F6CA7D599B5F}"/>
+<ds:datastoreItem xmlns:ds="http://schemas.openxmlformats.org/officeDocument/2006/customXml" ds:itemID="{109780CC-C618-4187-887A-920C23B40E96}"/>
 </file>
 
 <file path=customXml/itemProps3.xml><?xml version="1.0" encoding="utf-8"?>
-<ds:datastoreItem xmlns:ds="http://schemas.openxmlformats.org/officeDocument/2006/customXml" ds:itemID="{428AE774-BE28-41EE-A28A-F357E8D71434}"/>
+<ds:datastoreItem xmlns:ds="http://schemas.openxmlformats.org/officeDocument/2006/customXml" ds:itemID="{9B1C6BA9-D7E2-455C-9C6F-812F699B2902}"/>
 </file>
 
 <file path=customXml/itemProps4.xml><?xml version="1.0" encoding="utf-8"?>
-<ds:datastoreItem xmlns:ds="http://schemas.openxmlformats.org/officeDocument/2006/customXml" ds:itemID="{FB366035-C32A-4AB2-9C9F-966F7D0E0DD4}"/>
+<ds:datastoreItem xmlns:ds="http://schemas.openxmlformats.org/officeDocument/2006/customXml" ds:itemID="{7884A097-DCD4-427B-B6A6-953B0E800E3B}"/>
 </file>
</xml_diff>